<commit_message>
docs: publish reviewed beginner workshop materials
</commit_message>
<xml_diff>
--- a/docs/activity-cards.docx
+++ b/docs/activity-cards.docx
@@ -1052,7 +1052,16 @@
         <w:t>Run</w:t>
       </w:r>
       <w:r>
-        <w:t xml:space="preserve"> Open local Blockly simulation; select this mission; run the starter once. Use STOP and Reset before a different test. Save your workspace.</w:t>
+        <w:t xml:space="preserve"> Open local Blockly simulation; select this mission; run the starter once. Use STOP and </w:t>
+      </w:r>
+      <w:r>
+        <w:rPr>
+          <w:b/>
+        </w:rPr>
+        <w:t>Reset simulation</w:t>
+      </w:r>
+      <w:r>
+        <w:t xml:space="preserve"> before a different test. Save your workspace.</w:t>
       </w:r>
     </w:p>
     <w:p>
@@ -1384,7 +1393,45 @@
         <w:t>Observe</w:t>
       </w:r>
       <w:r>
-        <w:t xml:space="preserve"> Count output lines and compare the shared Python program JSON with the Blockly exported JSON.</w:t>
+        <w:t xml:space="preserve"> Count output lines. Open </w:t>
+      </w:r>
+      <w:r>
+        <w:rPr>
+          <w:b/>
+        </w:rPr>
+        <w:t>View executable Python</w:t>
+      </w:r>
+      <w:r>
+        <w:t xml:space="preserve"> in Blockly and compare the command rows in its </w:t>
+      </w:r>
+      <w:r>
+        <w:rPr>
+          <w:rFonts w:ascii="Noto Sans Mono" w:hAnsi="Noto Sans Mono"/>
+          <w:sz w:val="19"/>
+        </w:rPr>
+        <w:t>program</w:t>
+      </w:r>
+      <w:r>
+        <w:t xml:space="preserve"> list with </w:t>
+      </w:r>
+      <w:r>
+        <w:rPr>
+          <w:rFonts w:ascii="Noto Sans Mono" w:hAnsi="Noto Sans Mono"/>
+          <w:sz w:val="19"/>
+        </w:rPr>
+        <w:t>program.program</w:t>
+      </w:r>
+      <w:r>
+        <w:t xml:space="preserve"> in the shared Python example. JSON is text that stores the instruction list. </w:t>
+      </w:r>
+      <w:r>
+        <w:rPr>
+          <w:b/>
+        </w:rPr>
+        <w:t>Save blocks</w:t>
+      </w:r>
+      <w:r>
+        <w:t xml:space="preserve"> saves the workspace to reopen the editor; it is a different file.</w:t>
       </w:r>
     </w:p>
     <w:p>
@@ -1656,7 +1703,7 @@
         <w:t>Worked example</w:t>
       </w:r>
       <w:r>
-        <w:t xml:space="preserve"> Three pairs rotate through arm/twin observation, conveyor/observation sequencing, and offline Blockly/Python preparation.</w:t>
+        <w:t xml:space="preserve"> Completed SIMULATION sample using the earlier invented joint calculation: our prediction was 35° relative. We changed LEADER_NOW from 10° to 15°, keeping LEADER_START = 10° and FOLLOWER_START = 30°. The model calculation 30 + 15 - 10 printed 35° relative and 15° absolute. This is arithmetic, not a measured physical joint or evidence of safe motion. For arm observation use the existing Teach demo example (Watch teach inspect return replay) and Live notebook. For conveyor reports use the Observe and decide example (Separate the object from its report). For offline preparation use the shared Program example under Change a name and a number.</w:t>
       </w:r>
     </w:p>
     <w:p>
@@ -2136,7 +2183,7 @@
         <w:t>Worked example</w:t>
       </w:r>
       <w:r>
-        <w:t xml:space="preserve"> Pair A shows prediction, one change, observed result and one limit; then pairs B and C follow.</w:t>
+        <w:t xml:space="preserve"> Completed SIMULATION sample from the earlier Blockly message exercise: we predicted Ready would appear twice. We changed the repeat count from 1 to 2 around the Ready message. The simulated command log showed Ready twice. This checks message repetition only; it does not prove physical conveyor arrival or a grasp.</w:t>
       </w:r>
     </w:p>
     <w:p>

</xml_diff>

<commit_message>
fix(workshop): align beginner instructions and generated materials
Match the Blockly/Python starter, introduce teaching vocabulary before use and provide actual paper observation inputs. Preserve document images while projecting plain browser text and restore a real slide prediction prompt. Regenerated materials pass independent scoped review, 65 focused tests, three fresh notebooks, manifest/ZIP and changed-render checks. Durable evidence SHA256: 198c3720b34a45ec8260f6c39bac3786cbaf9d9c79a26f7295df44b4e8cfabf9. Physical rehearsal and main release remain open.
</commit_message>
<xml_diff>
--- a/docs/activity-cards.docx
+++ b/docs/activity-cards.docx
@@ -1185,7 +1185,43 @@
         <w:t>Worked example</w:t>
       </w:r>
       <w:r>
-        <w:t xml:space="preserve"> An actual blue brick can have a missing report. An actual red brick can be reported blue. Both need inspection.</w:t>
+        <w:t xml:space="preserve"> Use the human-labelled real photo collage notebooks/assets/photo-examples.jpg (also printed in the Student handbook under Separate the object from its report). Human labels describe visible objects. These reports are deliberately invented, not camera measurements. Row 1: actual red, report red. Row 2: actual blue, report None (missing). Row 3: actual red, report blue.</w:t>
+      </w:r>
+    </w:p>
+    <w:p>
+      <w:r>
+        <w:drawing>
+          <wp:inline xmlns:a="http://schemas.openxmlformats.org/drawingml/2006/main" xmlns:pic="http://schemas.openxmlformats.org/drawingml/2006/picture">
+            <wp:extent cx="6035040" cy="1439939"/>
+            <wp:docPr id="1" name="Picture 1"/>
+            <wp:cNvGraphicFramePr>
+              <a:graphicFrameLocks noChangeAspect="1"/>
+            </wp:cNvGraphicFramePr>
+            <a:graphic>
+              <a:graphicData uri="http://schemas.openxmlformats.org/drawingml/2006/picture">
+                <pic:pic>
+                  <pic:nvPicPr>
+                    <pic:cNvPr id="0" name="photo-examples.jpg"/>
+                    <pic:cNvPicPr/>
+                  </pic:nvPicPr>
+                  <pic:blipFill>
+                    <a:blip r:embed="rId9"/>
+                    <a:stretch>
+                      <a:fillRect/>
+                    </a:stretch>
+                  </pic:blipFill>
+                  <pic:spPr>
+                    <a:xfrm>
+                      <a:off x="0" y="0"/>
+                      <a:ext cx="6035040" cy="1439939"/>
+                    </a:xfrm>
+                    <a:prstGeom prst="rect"/>
+                  </pic:spPr>
+                </pic:pic>
+              </a:graphicData>
+            </a:graphic>
+          </wp:inline>
+        </w:drawing>
       </w:r>
     </w:p>
     <w:p>
@@ -1221,7 +1257,7 @@
         <w:t>Run</w:t>
       </w:r>
       <w:r>
-        <w:t xml:space="preserve"> Run the short Python example or trace its three rows on paper. Compare the real labelled photo with a deliberately changed report.</w:t>
+        <w:t xml:space="preserve"> Run the short Python example or trace these three rows on paper. Compare the human-labelled red/blue crops in notebooks/assets/photo-examples.jpg, also printed in the Student handbook under Separate the object from its report, with the invented reports.</w:t>
       </w:r>
     </w:p>
     <w:p>
@@ -1281,7 +1317,7 @@
         <w:t>Offline route</w:t>
       </w:r>
       <w:r>
-        <w:t xml:space="preserve"> Use the supplied real photo and handwritten report cards; no camera or website is needed.</w:t>
+        <w:t xml:space="preserve"> Paper pair: use the Student handbook's printed collage under Separate the object from its report, or open notebooks/assets/photo-examples.jpg from the learner ZIP. Use the three actual/report rows above and on your worksheet. These are human-visible labels with deliberately invented reports, not camera measurements.</w:t>
       </w:r>
     </w:p>
     <w:p>
@@ -1381,7 +1417,7 @@
         <w:t>Run</w:t>
       </w:r>
       <w:r>
-        <w:t xml:space="preserve"> Open the Student notebook, save a pair copy and run cells from the top with Shift+Enter. Run the shared Program example in simulation.</w:t>
+        <w:t xml:space="preserve"> Open the Student notebook, save a pair copy and run from the top with Shift+Enter. Run the shared Program example in simulation. In Blockly choose "Change a name and a number" before View executable Python.</w:t>
       </w:r>
     </w:p>
     <w:p>
@@ -1393,7 +1429,7 @@
         <w:t>Observe</w:t>
       </w:r>
       <w:r>
-        <w:t xml:space="preserve"> Count output lines. Open </w:t>
+        <w:t xml:space="preserve"> Count output lines. In Blockly choose "Change a name and a number", then </w:t>
       </w:r>
       <w:r>
         <w:rPr>
@@ -1402,7 +1438,7 @@
         <w:t>View executable Python</w:t>
       </w:r>
       <w:r>
-        <w:t xml:space="preserve"> in Blockly and compare the command rows in its </w:t>
+        <w:t xml:space="preserve">. Compare the command rows in its </w:t>
       </w:r>
       <w:r>
         <w:rPr>
@@ -1422,7 +1458,7 @@
         <w:t>program.program</w:t>
       </w:r>
       <w:r>
-        <w:t xml:space="preserve"> in the shared Python example. JSON is text that stores the instruction list. </w:t>
+        <w:t xml:space="preserve"> in the shared Python example: Ready, eject, left_end. JSON is text that stores the instruction list. </w:t>
       </w:r>
       <w:r>
         <w:rPr>
@@ -1431,7 +1467,7 @@
         <w:t>Save blocks</w:t>
       </w:r>
       <w:r>
-        <w:t xml:space="preserve"> saves the workspace to reopen the editor; it is a different file.</w:t>
+        <w:t xml:space="preserve"> saves the workspace to reopen the editor; it is a different file. Simulation only.</w:t>
       </w:r>
     </w:p>
     <w:p>
@@ -1531,7 +1567,7 @@
         <w:t>teach-demo</w:t>
       </w:r>
       <w:r>
-        <w:t xml:space="preserve"> · 15 minutes · Understand that a recorded stroke needs validated start/end poses and explicit jaw state.</w:t>
+        <w:t xml:space="preserve"> · 15 minutes · Understand one saved movement (a stroke) and its required start/end arm arrangement (pose), gripper opening (jaw state) and measured references (calibration).</w:t>
       </w:r>
     </w:p>
     <w:p>
@@ -1543,7 +1579,7 @@
         <w:t>Worked example</w:t>
       </w:r>
       <w:r>
-        <w:t xml:space="preserve"> Leader 10°, follower 30°, leader now 15° gives relative request 35°. A request and a measured result are different.</w:t>
+        <w:t xml:space="preserve"> A stroke is one saved movement. A pose is the arm arrangement at start/end. Jaw state means gripper opening. Calibration means the measured references a recording assumes. Metadata means recording details. Relative follows the change from each arm's starting angle: leader starts at 10°, follower at 30°, leader now 15°, so follower requests 30 + (15 - 10) = 35°. Absolute uses the leader's calibrated angle, 15°. These are invented DEMO angles. A request and a measured result are different.</w:t>
       </w:r>
     </w:p>
     <w:p>
@@ -1579,7 +1615,7 @@
         <w:t>Run</w:t>
       </w:r>
       <w:r>
-        <w:t xml:space="preserve"> Watch instructor: teach a short empty stroke, stop recording, inspect metadata and path, return safely to its validated start, then replay separately.</w:t>
+        <w:t xml:space="preserve"> Watch instructor: teach a short empty stroke, stop recording, inspect recording details and path, return safely to its validated start, then replay separately.</w:t>
       </w:r>
     </w:p>
     <w:p>
@@ -2307,7 +2343,7 @@
       </w:r>
     </w:p>
     <w:sectPr>
-      <w:footerReference w:type="default" r:id="rId9"/>
+      <w:footerReference w:type="default" r:id="rId10"/>
       <w:pgSz w:w="11909" w:h="16834"/>
       <w:pgMar w:top="936" w:right="1037" w:bottom="936" w:left="1037" w:header="720" w:footer="720" w:gutter="0"/>
       <w:cols w:space="720"/>

</xml_diff>